<commit_message>
Corrige datas de dezembro e janeiro e ajusta conteúdo de dezembro
Dezembro passa a ter 2 semanas de conteúdo (07-13/12 retrospectiva prática do ano, 14-20/12 vídeo/áudio de boas festas), com recesso de 21/12 a 03/01. Janeiro passa a começar em 04/01 (uma semana antes do que estava), com todas as datas subsequentes ajustadas.

Co-Authored-By: Claude Sonnet 5 <noreply@anthropic.com>
Claude-Session: https://claude.ai/code/session_01WSt3GY1qD8uPk293jNa2cE
</commit_message>
<xml_diff>
--- a/camila-sartori/materiais-grupo-vip/dezembro-comunidade.docx
+++ b/camila-sartori/materiais-grupo-vip/dezembro-comunidade.docx
@@ -66,7 +66,7 @@
           <w:i w:val="0"/>
           <w:sz w:val="21"/>
         </w:rPr>
-        <w:t>Semana 1: Balanço do ano com gentileza (PDF)</w:t>
+        <w:t>Semana 1: Retrospectiva do ano (PDF prático)</w:t>
       </w:r>
       <w:r>
         <w:br/>
@@ -86,7 +86,7 @@
           <w:i w:val="0"/>
           <w:sz w:val="21"/>
         </w:rPr>
-        <w:t>Semana 2: Recesso de fim de ano (sem conteúdo novo)</w:t>
+        <w:t>Semana 2: Mensagem de boas festas (vídeo/áudio)</w:t>
       </w:r>
       <w:r>
         <w:br/>
@@ -106,7 +106,27 @@
           <w:i w:val="0"/>
           <w:sz w:val="21"/>
         </w:rPr>
-        <w:t>Grupo volta com conteúdo normal em 11/01</w:t>
+        <w:t>21/12 a 03/01: recesso, sem conteúdo novo</w:t>
+      </w:r>
+      <w:r>
+        <w:br/>
+      </w:r>
+      <w:r>
+        <w:rPr>
+          <w:b w:val="0"/>
+          <w:i w:val="0"/>
+          <w:color w:val="9C1256"/>
+          <w:sz w:val="21"/>
+        </w:rPr>
+        <w:t xml:space="preserve">✿ </w:t>
+      </w:r>
+      <w:r>
+        <w:rPr>
+          <w:b w:val="0"/>
+          <w:i w:val="0"/>
+          <w:sz w:val="21"/>
+        </w:rPr>
+        <w:t>Grupo volta com conteúdo normal em 04/01</w:t>
       </w:r>
     </w:p>
     <w:p>
@@ -191,7 +211,7 @@
           <w:i w:val="0"/>
           <w:sz w:val="20"/>
         </w:rPr>
-        <w:t>Dezembro é sempre um mês corrido, então esse mês vai ser mais enxuto por aqui. Antes de entrarmos de vez no clima de festas, eu preparei uma reflexão pra fechar o ano com a gente.</w:t>
+        <w:t>Dezembro é sempre um mês corrido, então esse mês vai ser mais enxuto por aqui. Antes de entrarmos de vez no clima de festas, preparei uma retrospectiva pra fecharmos o ano juntas.</w:t>
       </w:r>
       <w:r>
         <w:br/>
@@ -246,7 +266,7 @@
           <w:color w:val="5A1042"/>
           <w:sz w:val="30"/>
         </w:rPr>
-        <w:t>Semana 1 (14–20/12)</w:t>
+        <w:t>Semana 1 (07–13/12)</w:t>
       </w:r>
     </w:p>
     <w:p>
@@ -260,7 +280,7 @@
           <w:color w:val="9C1256"/>
           <w:sz w:val="22"/>
         </w:rPr>
-        <w:t>Balanço do ano com gentileza</w:t>
+        <w:t>Retrospectiva do ano</w:t>
       </w:r>
     </w:p>
     <w:p>
@@ -275,7 +295,7 @@
           <w:color w:val="9C1256"/>
           <w:sz w:val="17"/>
         </w:rPr>
-        <w:t>PDF REFLEXIVO</w:t>
+        <w:t>PDF PRÁTICO</w:t>
       </w:r>
     </w:p>
     <w:p>
@@ -312,7 +332,7 @@
           <w:i w:val="0"/>
           <w:sz w:val="20"/>
         </w:rPr>
-        <w:t>Esse ano a gente trabalhou autoestima, relacionamentos e emoções aqui no grupo. Antes de virar a página pro ano novo, preparei um material pra revisar tudo isso com gentileza, sem cobrança.</w:t>
+        <w:t>Esse ano a gente trabalhou autoestima, relacionamentos e emoções aqui no grupo. Antes de virar a página pro ano novo, preparei um exercício de retrospectiva pra você olhar pra vida pessoal, pros relacionamentos e pra tudo que viveu esse ano, com gentileza.</w:t>
       </w:r>
       <w:r>
         <w:br/>
@@ -356,7 +376,7 @@
           <w:i w:val="0"/>
           <w:sz w:val="20"/>
         </w:rPr>
-        <w:t>Boa leitura! 💕</w:t>
+        <w:t>Bom exercício! 💕</w:t>
       </w:r>
     </w:p>
     <w:p>
@@ -387,7 +407,7 @@
           <w:i w:val="0"/>
           <w:sz w:val="19"/>
         </w:rPr>
-        <w:t>Dezembro · Semana 1 · Balanço do ano com gentileza.pdf</w:t>
+        <w:t>Dezembro · Semana 1 · Retrospectiva do ano.pdf</w:t>
       </w:r>
       <w:r>
         <w:rPr>
@@ -439,7 +459,242 @@
           <w:color w:val="5A1042"/>
           <w:sz w:val="30"/>
         </w:rPr>
-        <w:t>Semana 2 (21/12–10/01)</w:t>
+        <w:t>Semana 2 (14–20/12)</w:t>
+      </w:r>
+    </w:p>
+    <w:p>
+      <w:pPr>
+        <w:jc w:val="center"/>
+      </w:pPr>
+      <w:r>
+        <w:rPr>
+          <w:b/>
+          <w:i w:val="0"/>
+          <w:color w:val="9C1256"/>
+          <w:sz w:val="22"/>
+        </w:rPr>
+        <w:t>Mensagem de boas festas</w:t>
+      </w:r>
+    </w:p>
+    <w:p>
+      <w:pPr>
+        <w:spacing w:after="200"/>
+        <w:jc w:val="center"/>
+      </w:pPr>
+      <w:r>
+        <w:rPr>
+          <w:b/>
+          <w:i w:val="0"/>
+          <w:color w:val="9C1256"/>
+          <w:sz w:val="17"/>
+        </w:rPr>
+        <w:t>VÍDEO / ÁUDIO DA CAMILA</w:t>
+      </w:r>
+    </w:p>
+    <w:p>
+      <w:pPr>
+        <w:spacing w:after="280"/>
+        <w:shd w:val="clear" w:fill="FBEEF7"/>
+      </w:pPr>
+      <w:r>
+        <w:rPr>
+          <w:b/>
+          <w:i w:val="0"/>
+          <w:color w:val="9C1256"/>
+          <w:sz w:val="17"/>
+        </w:rPr>
+        <w:t>TEXTINHO DE APOIO (WHATSAPP)</w:t>
+      </w:r>
+      <w:r>
+        <w:br/>
+      </w:r>
+      <w:r>
+        <w:rPr>
+          <w:b w:val="0"/>
+          <w:i w:val="0"/>
+          <w:sz w:val="20"/>
+        </w:rPr>
+        <w:t>Boa tarde, mulheres donas de si! 🎄</w:t>
+      </w:r>
+      <w:r>
+        <w:br/>
+      </w:r>
+      <w:r>
+        <w:rPr>
+          <w:b w:val="0"/>
+          <w:i w:val="0"/>
+          <w:sz w:val="20"/>
+        </w:rPr>
+        <w:t>Antes da gente entrar de vez no clima de festas, gravei um vídeo rapidinho pra fechar o ano com vocês.</w:t>
+      </w:r>
+      <w:r>
+        <w:br/>
+      </w:r>
+      <w:r>
+        <w:rPr>
+          <w:b w:val="0"/>
+          <w:i w:val="0"/>
+          <w:sz w:val="20"/>
+        </w:rPr>
+        <w:t>Solta o play:</w:t>
+      </w:r>
+      <w:r>
+        <w:br/>
+      </w:r>
+      <w:r>
+        <w:rPr>
+          <w:b w:val="0"/>
+          <w:i w:val="0"/>
+          <w:sz w:val="20"/>
+        </w:rPr>
+        <w:t>[vídeo/áudio]</w:t>
+      </w:r>
+      <w:r>
+        <w:br/>
+      </w:r>
+      <w:r>
+        <w:rPr>
+          <w:b w:val="0"/>
+          <w:i w:val="0"/>
+          <w:sz w:val="20"/>
+        </w:rPr>
+        <w:t>Boas festas! 💕</w:t>
+      </w:r>
+    </w:p>
+    <w:p>
+      <w:pPr>
+        <w:spacing w:before="200" w:after="60"/>
+      </w:pPr>
+      <w:r>
+        <w:rPr>
+          <w:b/>
+          <w:i w:val="0"/>
+          <w:color w:val="9C1256"/>
+          <w:sz w:val="23"/>
+        </w:rPr>
+        <w:t>Roteiro (vídeo até 90s, ou áudio)</w:t>
+      </w:r>
+    </w:p>
+    <w:p>
+      <w:pPr>
+        <w:spacing w:after="160"/>
+      </w:pPr>
+      <w:r>
+        <w:rPr>
+          <w:b w:val="0"/>
+          <w:i/>
+          <w:sz w:val="20"/>
+        </w:rPr>
+        <w:t>"Eu queria vir aqui agradecer vocês por esse ano inteiro de caminhada juntas.</w:t>
+      </w:r>
+    </w:p>
+    <w:p>
+      <w:pPr>
+        <w:spacing w:after="160"/>
+      </w:pPr>
+      <w:r>
+        <w:rPr>
+          <w:b w:val="0"/>
+          <w:i/>
+          <w:sz w:val="20"/>
+        </w:rPr>
+        <w:t>A gente falou sobre autoestima, sobre relacionamentos, sobre emoções, e eu espero de coração que alguma coisa desse ano tenha feito sentido pra sua vida.</w:t>
+      </w:r>
+    </w:p>
+    <w:p>
+      <w:pPr>
+        <w:spacing w:after="160"/>
+      </w:pPr>
+      <w:r>
+        <w:rPr>
+          <w:b w:val="0"/>
+          <w:i/>
+          <w:sz w:val="20"/>
+        </w:rPr>
+        <w:t>Agora é hora de descansar, celebrar e aproveitar quem vocês amam. Não se cobrem por nada nesse período, nem por manter rotina, nem por "aproveitar direito", só vivam o momento.</w:t>
+      </w:r>
+    </w:p>
+    <w:p>
+      <w:pPr>
+        <w:spacing w:after="160"/>
+      </w:pPr>
+      <w:r>
+        <w:rPr>
+          <w:b w:val="0"/>
+          <w:i/>
+          <w:sz w:val="20"/>
+        </w:rPr>
+        <w:t>A gente se reencontra por aqui com conteúdo novo já no dia 4 de janeiro. Um brinde a tudo que vocês construíram em 2026, e ao que vem por aí. Boas festas!"</w:t>
+      </w:r>
+    </w:p>
+    <w:p>
+      <w:pPr>
+        <w:spacing w:after="200"/>
+      </w:pPr>
+      <w:r>
+        <w:rPr>
+          <w:b/>
+          <w:i w:val="0"/>
+          <w:color w:val="9C1256"/>
+          <w:sz w:val="18"/>
+        </w:rPr>
+        <w:t>PLANO B, SE NÃO DER PRA GRAVAR VÍDEO OU ÁUDIO</w:t>
+      </w:r>
+      <w:r>
+        <w:br/>
+      </w:r>
+      <w:r>
+        <w:rPr>
+          <w:b w:val="0"/>
+          <w:i w:val="0"/>
+          <w:color w:val="6B4B60"/>
+          <w:sz w:val="19"/>
+        </w:rPr>
+        <w:t>Mandar a mesma mensagem em formato de texto, escrita em primeira pessoa, como se fosse a Camila falando diretamente no grupo. O conteúdo é idêntico ao roteiro acima, só sem o vídeo.</w:t>
+      </w:r>
+    </w:p>
+    <w:p>
+      <w:pPr>
+        <w:spacing w:before="280"/>
+        <w:jc w:val="center"/>
+      </w:pPr>
+      <w:r>
+        <w:rPr>
+          <w:b/>
+          <w:i w:val="0"/>
+          <w:color w:val="9C1256"/>
+          <w:sz w:val="16"/>
+        </w:rPr>
+        <w:t>@psicamilasartori</w:t>
+      </w:r>
+      <w:r>
+        <w:rPr>
+          <w:b w:val="0"/>
+          <w:i w:val="0"/>
+          <w:color w:val="6B4B60"/>
+          <w:sz w:val="16"/>
+        </w:rPr>
+        <w:t xml:space="preserve"> · curso-ame-se.camilasartori.com.br · Material criado pela Agência Recria</w:t>
+      </w:r>
+    </w:p>
+    <w:p>
+      <w:r>
+        <w:br w:type="page"/>
+      </w:r>
+    </w:p>
+    <w:p>
+      <w:pPr>
+        <w:spacing w:before="120"/>
+        <w:jc w:val="center"/>
+      </w:pPr>
+      <w:r>
+        <w:rPr>
+          <w:b/>
+          <w:i w:val="0"/>
+          <w:color w:val="5A1042"/>
+          <w:sz w:val="30"/>
+        </w:rPr>
+        <w:t>21/12 a 03/01</w:t>
       </w:r>
     </w:p>
     <w:p>
@@ -505,7 +760,7 @@
           <w:i w:val="0"/>
           <w:sz w:val="20"/>
         </w:rPr>
-        <w:t>A gente entra agora em recesso de fim de ano por aqui, sem conteúdo novo, pra vocês aproveitarem as festas com quem amam, e eu aproveitar com quem eu amo também.</w:t>
+        <w:t>A gente entra agora em recesso de fim de ano por aqui, sem conteúdo novo, pra vocês aproveitarem as festas com quem amam.</w:t>
       </w:r>
       <w:r>
         <w:br/>
@@ -516,29 +771,7 @@
           <w:i w:val="0"/>
           <w:sz w:val="20"/>
         </w:rPr>
-        <w:t>Aproveita esse tempo pra descansar, celebrar e também praticar tudo o que a gente conversou esse ano por aqui, com gentileza e sem cobrança.</w:t>
-      </w:r>
-      <w:r>
-        <w:br/>
-      </w:r>
-      <w:r>
-        <w:rPr>
-          <w:b w:val="0"/>
-          <w:i w:val="0"/>
-          <w:sz w:val="20"/>
-        </w:rPr>
-        <w:t>A gente se reencontra com conteúdo novo já no dia 11 de janeiro. Um brinde a tudo que vocês construíram em 2026! 🥂</w:t>
-      </w:r>
-      <w:r>
-        <w:br/>
-      </w:r>
-      <w:r>
-        <w:rPr>
-          <w:b w:val="0"/>
-          <w:i w:val="0"/>
-          <w:sz w:val="20"/>
-        </w:rPr>
-        <w:t>Boas festas! 💕</w:t>
+        <w:t>A gente se reencontra com conteúdo novo já no dia 4 de janeiro. Boas festas! 🥂</w:t>
       </w:r>
     </w:p>
     <w:p>

</xml_diff>